<commit_message>
Update base with base stuff
</commit_message>
<xml_diff>
--- a/resume/Base.docx
+++ b/resume/Base.docx
@@ -287,21 +287,13 @@
         </w:rPr>
       </w:pPr>
       <w:r>
-        <w:t>Electrical Engineering</w:t>
-      </w:r>
-      <w:r>
-        <w:t xml:space="preserve"> Student</w:t>
-      </w:r>
-      <w:r>
-        <w:t xml:space="preserve"> (Co-op) – </w:t>
-      </w:r>
-      <w:proofErr w:type="spellStart"/>
-      <w:r>
-        <w:t>Wrmth</w:t>
-      </w:r>
-      <w:proofErr w:type="spellEnd"/>
-      <w:r>
-        <w:t xml:space="preserve"> Corp.</w:t>
+        <w:t>Software Developer (Co-op)</w:t>
+      </w:r>
+      <w:r>
+        <w:t xml:space="preserve"> – </w:t>
+      </w:r>
+      <w:r>
+        <w:t>Base Power Company</w:t>
       </w:r>
       <w:r>
         <w:tab/>
@@ -310,7 +302,43 @@
         <w:rPr>
           <w:rStyle w:val="Heading3Char"/>
         </w:rPr>
-        <w:t>May 2025 – August 2025</w:t>
+        <w:t>January</w:t>
+      </w:r>
+      <w:r>
+        <w:rPr>
+          <w:rStyle w:val="Heading3Char"/>
+        </w:rPr>
+        <w:t xml:space="preserve"> 202</w:t>
+      </w:r>
+      <w:r>
+        <w:rPr>
+          <w:rStyle w:val="Heading3Char"/>
+        </w:rPr>
+        <w:t>6</w:t>
+      </w:r>
+      <w:r>
+        <w:rPr>
+          <w:rStyle w:val="Heading3Char"/>
+        </w:rPr>
+        <w:t xml:space="preserve"> – </w:t>
+      </w:r>
+      <w:r>
+        <w:rPr>
+          <w:rStyle w:val="Heading3Char"/>
+        </w:rPr>
+        <w:t xml:space="preserve">April </w:t>
+      </w:r>
+      <w:r>
+        <w:rPr>
+          <w:rStyle w:val="Heading3Char"/>
+        </w:rPr>
+        <w:t>202</w:t>
+      </w:r>
+      <w:r>
+        <w:rPr>
+          <w:rStyle w:val="Heading3Char"/>
+        </w:rPr>
+        <w:t>6</w:t>
       </w:r>
     </w:p>
     <w:p>
@@ -323,22 +351,40 @@
         <w:ind w:left="426" w:hanging="284"/>
       </w:pPr>
       <w:r>
-        <w:t xml:space="preserve">Worked as an electrical </w:t>
-      </w:r>
-      <w:r>
-        <w:t xml:space="preserve">engineering student designing </w:t>
-      </w:r>
-      <w:r>
-        <w:t xml:space="preserve">printed </w:t>
-      </w:r>
-      <w:r>
-        <w:t>circuit boards</w:t>
+        <w:t xml:space="preserve">Built a </w:t>
+      </w:r>
+      <w:r>
+        <w:t xml:space="preserve">custom manufacturing execution system to coordinate processes </w:t>
+      </w:r>
+      <w:r>
+        <w:t>in</w:t>
+      </w:r>
+      <w:r>
+        <w:t xml:space="preserve"> a production line</w:t>
+      </w:r>
+      <w:r>
+        <w:t>, using</w:t>
       </w:r>
       <w:r>
         <w:t xml:space="preserve"> </w:t>
       </w:r>
       <w:r>
-        <w:t>for mass production of heated outdoor furniture.</w:t>
+        <w:t>Go</w:t>
+      </w:r>
+      <w:r>
+        <w:t>lang</w:t>
+      </w:r>
+      <w:r>
+        <w:t>, React/TypeScript, and PostgreSQL</w:t>
+      </w:r>
+      <w:r>
+        <w:t xml:space="preserve">, enabling </w:t>
+      </w:r>
+      <w:r>
+        <w:t xml:space="preserve">detailed metrics </w:t>
+      </w:r>
+      <w:r>
+        <w:t>of quality, costs, and operational capability.</w:t>
       </w:r>
     </w:p>
     <w:p>
@@ -351,19 +397,61 @@
         <w:ind w:left="426" w:hanging="284"/>
       </w:pPr>
       <w:r>
-        <w:t>Created</w:t>
-      </w:r>
-      <w:r>
-        <w:t xml:space="preserve"> and r</w:t>
-      </w:r>
-      <w:r>
-        <w:t xml:space="preserve">eviewed schematics for prototyping and mass production, ensuring </w:t>
-      </w:r>
-      <w:r>
-        <w:t xml:space="preserve">performance </w:t>
-      </w:r>
-      <w:r>
-        <w:t>in sub-optimal conditions</w:t>
+        <w:t xml:space="preserve">Optimized </w:t>
+      </w:r>
+      <w:r>
+        <w:t xml:space="preserve">manufacturing process and shared contracts through data model </w:t>
+      </w:r>
+      <w:r>
+        <w:t>design and coordination.</w:t>
+      </w:r>
+    </w:p>
+    <w:p>
+      <w:pPr>
+        <w:pStyle w:val="ListParagraph"/>
+        <w:numPr>
+          <w:ilvl w:val="0"/>
+          <w:numId w:val="2"/>
+        </w:numPr>
+        <w:ind w:left="426" w:hanging="284"/>
+      </w:pPr>
+      <w:r>
+        <w:t xml:space="preserve">Designed a query builder library with composable filter abstractions, </w:t>
+      </w:r>
+      <w:r>
+        <w:t>allowing reusable code generation.</w:t>
+      </w:r>
+    </w:p>
+    <w:p>
+      <w:pPr>
+        <w:pStyle w:val="ListParagraph"/>
+        <w:numPr>
+          <w:ilvl w:val="0"/>
+          <w:numId w:val="2"/>
+        </w:numPr>
+        <w:ind w:left="426" w:hanging="284"/>
+      </w:pPr>
+      <w:r>
+        <w:t xml:space="preserve">Engineered a bi-directional ERP integration using Temporal workflows to synchronize </w:t>
+      </w:r>
+      <w:r>
+        <w:t>inventory tracking.</w:t>
+      </w:r>
+    </w:p>
+    <w:p>
+      <w:pPr>
+        <w:pStyle w:val="ListParagraph"/>
+        <w:numPr>
+          <w:ilvl w:val="0"/>
+          <w:numId w:val="2"/>
+        </w:numPr>
+        <w:ind w:left="426" w:hanging="284"/>
+      </w:pPr>
+      <w:r>
+        <w:t>Built</w:t>
+      </w:r>
+      <w:r>
+        <w:t xml:space="preserve"> E2E testing infrastructure with Playwright, Docker-based test environments, and GitHub Actions CI triggers</w:t>
       </w:r>
       <w:r>
         <w:t>.</w:t>
@@ -379,44 +467,14 @@
         <w:ind w:left="426" w:hanging="284"/>
       </w:pPr>
       <w:r>
-        <w:t>Designed</w:t>
-      </w:r>
-      <w:r>
-        <w:t xml:space="preserve"> and routed</w:t>
+        <w:t>Engineered deploy pipeline optimizations</w:t>
+      </w:r>
+      <w:r>
+        <w:t>, doubling the speed from push to deployment, reducing engineering cycle time.</w:t>
       </w:r>
       <w:r>
         <w:t xml:space="preserve"> </w:t>
       </w:r>
-      <w:r>
-        <w:t>multi-layer PCBs for mass manufacturing</w:t>
-      </w:r>
-      <w:r>
-        <w:t xml:space="preserve"> and reliability</w:t>
-      </w:r>
-      <w:r>
-        <w:t xml:space="preserve">, </w:t>
-      </w:r>
-      <w:r>
-        <w:t xml:space="preserve">reducing </w:t>
-      </w:r>
-      <w:r>
-        <w:t>board costs</w:t>
-      </w:r>
-      <w:r>
-        <w:t xml:space="preserve"> </w:t>
-      </w:r>
-      <w:r>
-        <w:t xml:space="preserve">by </w:t>
-      </w:r>
-      <w:r>
-        <w:t xml:space="preserve">approximately </w:t>
-      </w:r>
-      <w:r>
-        <w:t>80%</w:t>
-      </w:r>
-      <w:r>
-        <w:t>.</w:t>
-      </w:r>
     </w:p>
     <w:p>
       <w:pPr>
@@ -428,137 +486,10 @@
         <w:ind w:left="426" w:hanging="284"/>
       </w:pPr>
       <w:r>
-        <w:t xml:space="preserve">Created test procedures and </w:t>
-      </w:r>
-      <w:r>
-        <w:t>used oscilloscope debugging techniques to validate circuit board functionality</w:t>
-      </w:r>
-      <w:r>
-        <w:t xml:space="preserve"> and performance</w:t>
-      </w:r>
-      <w:r>
-        <w:t>.</w:t>
-      </w:r>
-    </w:p>
-    <w:p>
-      <w:pPr>
-        <w:pStyle w:val="ListParagraph"/>
-        <w:numPr>
-          <w:ilvl w:val="0"/>
-          <w:numId w:val="2"/>
-        </w:numPr>
-        <w:ind w:left="426" w:hanging="284"/>
-      </w:pPr>
-      <w:r>
-        <w:t xml:space="preserve">Designed and programmed </w:t>
-      </w:r>
-      <w:r>
-        <w:t xml:space="preserve">a custom </w:t>
-      </w:r>
-      <w:r>
-        <w:t>3D printed</w:t>
-      </w:r>
-      <w:r>
-        <w:t xml:space="preserve"> SCARA robotic arm for </w:t>
-      </w:r>
-      <w:r>
-        <w:t xml:space="preserve">additive and subtractive manufacturing </w:t>
-      </w:r>
-      <w:r>
-        <w:t xml:space="preserve">and </w:t>
-      </w:r>
-      <w:r>
-        <w:t>production.</w:t>
-      </w:r>
-    </w:p>
-    <w:p>
-      <w:pPr>
-        <w:pStyle w:val="ListParagraph"/>
-        <w:numPr>
-          <w:ilvl w:val="0"/>
-          <w:numId w:val="2"/>
-        </w:numPr>
-        <w:ind w:left="426" w:hanging="284"/>
-      </w:pPr>
-      <w:r>
-        <w:t>Programmed a custom G-code slicer/translator, including inverse kinematics</w:t>
-      </w:r>
-      <w:r>
-        <w:t>, safety end stops,</w:t>
-      </w:r>
-      <w:r>
-        <w:t xml:space="preserve"> and </w:t>
-      </w:r>
-      <w:r>
-        <w:t>controlled feed</w:t>
-      </w:r>
-      <w:r>
-        <w:t>-</w:t>
-      </w:r>
-      <w:r>
-        <w:t>rate.</w:t>
-      </w:r>
-    </w:p>
-    <w:p>
-      <w:pPr>
-        <w:pStyle w:val="ListParagraph"/>
-        <w:numPr>
-          <w:ilvl w:val="0"/>
-          <w:numId w:val="2"/>
-        </w:numPr>
-        <w:ind w:left="426" w:hanging="284"/>
-      </w:pPr>
-      <w:r>
-        <w:t xml:space="preserve">Built an </w:t>
-      </w:r>
-      <w:r>
-        <w:t>IoT</w:t>
-      </w:r>
-      <w:r>
-        <w:t xml:space="preserve"> communication architecture for </w:t>
-      </w:r>
-      <w:r>
-        <w:t xml:space="preserve">component </w:t>
-      </w:r>
-      <w:r>
-        <w:t xml:space="preserve">plug-and-play reusability </w:t>
-      </w:r>
-      <w:r>
-        <w:t xml:space="preserve">and rapid prototyping </w:t>
-      </w:r>
-      <w:r>
-        <w:t>support</w:t>
-      </w:r>
-      <w:r>
-        <w:t>.</w:t>
-      </w:r>
-      <w:r>
-        <w:t xml:space="preserve"> </w:t>
-      </w:r>
-    </w:p>
-    <w:p>
-      <w:pPr>
-        <w:pStyle w:val="ListParagraph"/>
-        <w:numPr>
-          <w:ilvl w:val="0"/>
-          <w:numId w:val="2"/>
-        </w:numPr>
-        <w:ind w:left="426" w:hanging="284"/>
-      </w:pPr>
-      <w:r>
-        <w:t xml:space="preserve">Improved manufacturing processes with </w:t>
-      </w:r>
-      <w:r>
-        <w:t xml:space="preserve">logistical and </w:t>
-      </w:r>
-      <w:r>
-        <w:t>3D printed solutions, saving time and money in productio</w:t>
-      </w:r>
-      <w:r>
-        <w:t>n</w:t>
-      </w:r>
-      <w:r>
-        <w:t>.</w:t>
+        <w:t>Managed infrastructure across Terraform, Pkl service configuration, and AWS</w:t>
+      </w:r>
+      <w:r>
+        <w:t xml:space="preserve"> to build systems for reliability and uptime.</w:t>
       </w:r>
     </w:p>
     <w:p>
@@ -572,13 +503,16 @@
         </w:rPr>
       </w:pPr>
       <w:r>
-        <w:t>Operational Software Developer (Co-op)</w:t>
-      </w:r>
-      <w:r>
-        <w:t xml:space="preserve"> – </w:t>
-      </w:r>
-      <w:r>
-        <w:t>Rocket Factory Augsburg</w:t>
+        <w:t>Electrical Engineering</w:t>
+      </w:r>
+      <w:r>
+        <w:t xml:space="preserve"> Student</w:t>
+      </w:r>
+      <w:r>
+        <w:t xml:space="preserve"> (Co-op) – Wrmth</w:t>
+      </w:r>
+      <w:r>
+        <w:t xml:space="preserve"> Corp.</w:t>
       </w:r>
       <w:r>
         <w:tab/>
@@ -587,19 +521,35 @@
         <w:rPr>
           <w:rStyle w:val="Heading3Char"/>
         </w:rPr>
-        <w:t>September 2024 –</w:t>
-      </w:r>
-      <w:r>
-        <w:rPr>
-          <w:rStyle w:val="Heading3Char"/>
-        </w:rPr>
+        <w:t>May 2025 – August 2025</w:t>
+      </w:r>
+    </w:p>
+    <w:p>
+      <w:pPr>
+        <w:pStyle w:val="ListParagraph"/>
+        <w:numPr>
+          <w:ilvl w:val="0"/>
+          <w:numId w:val="2"/>
+        </w:numPr>
+        <w:ind w:left="426" w:hanging="284"/>
+      </w:pPr>
+      <w:r>
+        <w:t xml:space="preserve">Worked as an electrical </w:t>
+      </w:r>
+      <w:r>
+        <w:t xml:space="preserve">engineering student designing </w:t>
+      </w:r>
+      <w:r>
+        <w:t xml:space="preserve">printed </w:t>
+      </w:r>
+      <w:r>
+        <w:t>circuit boards</w:t>
+      </w:r>
+      <w:r>
         <w:t xml:space="preserve"> </w:t>
       </w:r>
       <w:r>
-        <w:rPr>
-          <w:rStyle w:val="Heading3Char"/>
-        </w:rPr>
-        <w:t>December 2024</w:t>
+        <w:t>for mass production of heated outdoor furniture.</w:t>
       </w:r>
     </w:p>
     <w:p>
@@ -612,19 +562,19 @@
         <w:ind w:left="426" w:hanging="284"/>
       </w:pPr>
       <w:r>
-        <w:t xml:space="preserve">Developed </w:t>
-      </w:r>
-      <w:r>
-        <w:t xml:space="preserve">operational tools for a 300-person team </w:t>
-      </w:r>
-      <w:r>
-        <w:t>building</w:t>
-      </w:r>
-      <w:r>
-        <w:t xml:space="preserve"> advanced rocket technology</w:t>
-      </w:r>
-      <w:r>
-        <w:t>, using React and FastAPI</w:t>
+        <w:t>Created</w:t>
+      </w:r>
+      <w:r>
+        <w:t xml:space="preserve"> and r</w:t>
+      </w:r>
+      <w:r>
+        <w:t xml:space="preserve">eviewed schematics for prototyping and mass production, ensuring </w:t>
+      </w:r>
+      <w:r>
+        <w:t xml:space="preserve">performance </w:t>
+      </w:r>
+      <w:r>
+        <w:t>in sub-optimal conditions</w:t>
       </w:r>
       <w:r>
         <w:t>.</w:t>
@@ -640,10 +590,40 @@
         <w:ind w:left="426" w:hanging="284"/>
       </w:pPr>
       <w:r>
-        <w:t>Implemented</w:t>
-      </w:r>
-      <w:r>
-        <w:t xml:space="preserve"> web application features for part and assembly tracking, directly improving production workflow</w:t>
+        <w:t>Designed</w:t>
+      </w:r>
+      <w:r>
+        <w:t xml:space="preserve"> and routed</w:t>
+      </w:r>
+      <w:r>
+        <w:t xml:space="preserve"> </w:t>
+      </w:r>
+      <w:r>
+        <w:t>multi-layer PCBs for mass manufacturing</w:t>
+      </w:r>
+      <w:r>
+        <w:t xml:space="preserve"> and reliability</w:t>
+      </w:r>
+      <w:r>
+        <w:t xml:space="preserve">, </w:t>
+      </w:r>
+      <w:r>
+        <w:t xml:space="preserve">reducing </w:t>
+      </w:r>
+      <w:r>
+        <w:t>board costs</w:t>
+      </w:r>
+      <w:r>
+        <w:t xml:space="preserve"> </w:t>
+      </w:r>
+      <w:r>
+        <w:t xml:space="preserve">by </w:t>
+      </w:r>
+      <w:r>
+        <w:t xml:space="preserve">approximately </w:t>
+      </w:r>
+      <w:r>
+        <w:t>80%</w:t>
       </w:r>
       <w:r>
         <w:t>.</w:t>
@@ -659,19 +639,16 @@
         <w:ind w:left="426" w:hanging="284"/>
       </w:pPr>
       <w:r>
-        <w:t>Designed and b</w:t>
-      </w:r>
-      <w:r>
-        <w:t xml:space="preserve">uilt a </w:t>
-      </w:r>
-      <w:r>
-        <w:t xml:space="preserve">time tracking application used company-wide, reducing administrative overhead by </w:t>
-      </w:r>
-      <w:r>
-        <w:t>an estimated 60-70</w:t>
-      </w:r>
-      <w:r>
-        <w:t>%.</w:t>
+        <w:t xml:space="preserve">Created test procedures and </w:t>
+      </w:r>
+      <w:r>
+        <w:t>used oscilloscope debugging techniques to validate circuit board functionality</w:t>
+      </w:r>
+      <w:r>
+        <w:t xml:space="preserve"> and performance</w:t>
+      </w:r>
+      <w:r>
+        <w:t>.</w:t>
       </w:r>
     </w:p>
     <w:p>
@@ -684,35 +661,91 @@
         <w:ind w:left="426" w:hanging="284"/>
       </w:pPr>
       <w:r>
-        <w:t>I</w:t>
-      </w:r>
-      <w:r>
-        <w:t xml:space="preserve">mproved </w:t>
-      </w:r>
-      <w:r>
-        <w:t>advanced</w:t>
-      </w:r>
-      <w:r>
-        <w:t xml:space="preserve"> database</w:t>
-      </w:r>
-      <w:r>
-        <w:t xml:space="preserve"> ORM</w:t>
+        <w:t xml:space="preserve">Designed and programmed </w:t>
+      </w:r>
+      <w:r>
+        <w:t xml:space="preserve">a custom </w:t>
+      </w:r>
+      <w:r>
+        <w:t>3D printed</w:t>
+      </w:r>
+      <w:r>
+        <w:t xml:space="preserve"> SCARA robotic arm for </w:t>
+      </w:r>
+      <w:r>
+        <w:t xml:space="preserve">additive and subtractive manufacturing </w:t>
+      </w:r>
+      <w:r>
+        <w:t xml:space="preserve">and </w:t>
+      </w:r>
+      <w:r>
+        <w:t>production.</w:t>
+      </w:r>
+    </w:p>
+    <w:p>
+      <w:pPr>
+        <w:pStyle w:val="ListParagraph"/>
+        <w:numPr>
+          <w:ilvl w:val="0"/>
+          <w:numId w:val="2"/>
+        </w:numPr>
+        <w:ind w:left="426" w:hanging="284"/>
+      </w:pPr>
+      <w:r>
+        <w:t>Programmed a custom G-code slicer/translator, including inverse kinematics</w:t>
+      </w:r>
+      <w:r>
+        <w:t>, safety end stops,</w:t>
+      </w:r>
+      <w:r>
+        <w:t xml:space="preserve"> and </w:t>
+      </w:r>
+      <w:r>
+        <w:t>controlled feed</w:t>
+      </w:r>
+      <w:r>
+        <w:t>-</w:t>
+      </w:r>
+      <w:r>
+        <w:t>rate.</w:t>
+      </w:r>
+    </w:p>
+    <w:p>
+      <w:pPr>
+        <w:pStyle w:val="ListParagraph"/>
+        <w:numPr>
+          <w:ilvl w:val="0"/>
+          <w:numId w:val="2"/>
+        </w:numPr>
+        <w:ind w:left="426" w:hanging="284"/>
+      </w:pPr>
+      <w:r>
+        <w:t xml:space="preserve">Built an </w:t>
+      </w:r>
+      <w:r>
+        <w:t>IoT</w:t>
+      </w:r>
+      <w:r>
+        <w:t xml:space="preserve"> communication architecture for </w:t>
+      </w:r>
+      <w:r>
+        <w:t xml:space="preserve">component </w:t>
+      </w:r>
+      <w:r>
+        <w:t xml:space="preserve">plug-and-play reusability </w:t>
+      </w:r>
+      <w:r>
+        <w:t xml:space="preserve">and rapid prototyping </w:t>
+      </w:r>
+      <w:r>
+        <w:t>support</w:t>
+      </w:r>
+      <w:r>
+        <w:t>.</w:t>
       </w:r>
       <w:r>
         <w:t xml:space="preserve"> </w:t>
       </w:r>
-      <w:r>
-        <w:t>architectures for scalability and speed in PostgreSQL</w:t>
-      </w:r>
-      <w:r>
-        <w:t xml:space="preserve">, reducing complexity </w:t>
-      </w:r>
-      <w:r>
-        <w:t>immensely</w:t>
-      </w:r>
-      <w:r>
-        <w:t>.</w:t>
-      </w:r>
     </w:p>
     <w:p>
       <w:pPr>
@@ -724,112 +757,16 @@
         <w:ind w:left="426" w:hanging="284"/>
       </w:pPr>
       <w:r>
-        <w:t>Optimized</w:t>
-      </w:r>
-      <w:r>
-        <w:t xml:space="preserve"> codebase structure, refactoring and </w:t>
-      </w:r>
-      <w:r>
-        <w:t xml:space="preserve">enhancing </w:t>
-      </w:r>
-      <w:r>
-        <w:t xml:space="preserve">existing code to enhance </w:t>
-      </w:r>
-      <w:r>
-        <w:t>performance</w:t>
-      </w:r>
-      <w:r>
-        <w:t>, reusability, and scalability.</w:t>
-      </w:r>
-    </w:p>
-    <w:p>
-      <w:pPr>
-        <w:pStyle w:val="ListParagraph"/>
-        <w:numPr>
-          <w:ilvl w:val="0"/>
-          <w:numId w:val="2"/>
-        </w:numPr>
-        <w:ind w:left="426" w:hanging="284"/>
-      </w:pPr>
-      <w:r>
-        <w:t>Utilized Git pipelines</w:t>
-      </w:r>
-      <w:r>
-        <w:t xml:space="preserve"> </w:t>
-      </w:r>
-      <w:r>
-        <w:t>to improve testing and</w:t>
-      </w:r>
-      <w:r>
-        <w:t xml:space="preserve"> deployment of applications</w:t>
-      </w:r>
-      <w:r>
-        <w:t xml:space="preserve">, ensuring quality </w:t>
-      </w:r>
-      <w:r>
-        <w:t>and usability of tools</w:t>
-      </w:r>
-      <w:r>
-        <w:t>.</w:t>
-      </w:r>
-    </w:p>
-    <w:p>
-      <w:pPr>
-        <w:pStyle w:val="ListParagraph"/>
-        <w:numPr>
-          <w:ilvl w:val="0"/>
-          <w:numId w:val="2"/>
-        </w:numPr>
-        <w:ind w:left="426" w:hanging="284"/>
-      </w:pPr>
-      <w:r>
-        <w:t xml:space="preserve">Implemented CRUD features in a modular manner, allowing for optimal code reuse and development ease. </w:t>
-      </w:r>
-    </w:p>
-    <w:p>
-      <w:pPr>
-        <w:pStyle w:val="ListParagraph"/>
-        <w:numPr>
-          <w:ilvl w:val="0"/>
-          <w:numId w:val="2"/>
-        </w:numPr>
-        <w:ind w:left="426" w:hanging="284"/>
-      </w:pPr>
-      <w:r>
-        <w:t>Utilized planning</w:t>
-      </w:r>
-      <w:r>
-        <w:t xml:space="preserve">, </w:t>
-      </w:r>
-      <w:r>
-        <w:t>project management</w:t>
-      </w:r>
-      <w:r>
-        <w:t>, and communication</w:t>
-      </w:r>
-      <w:r>
-        <w:t xml:space="preserve"> skills to ensure adoption and </w:t>
-      </w:r>
-      <w:r>
-        <w:t>integration</w:t>
-      </w:r>
-      <w:r>
-        <w:t xml:space="preserve"> of </w:t>
-      </w:r>
-      <w:r>
-        <w:t>tools</w:t>
-      </w:r>
-      <w:r>
-        <w:t xml:space="preserve"> (studying workflow</w:t>
-      </w:r>
-      <w:r>
-        <w:t>s</w:t>
-      </w:r>
-      <w:r>
-        <w:t xml:space="preserve"> and</w:t>
-      </w:r>
-      <w:r>
-        <w:t xml:space="preserve"> designing with the user in mind)</w:t>
+        <w:t xml:space="preserve">Improved manufacturing processes with </w:t>
+      </w:r>
+      <w:r>
+        <w:t xml:space="preserve">logistical and </w:t>
+      </w:r>
+      <w:r>
+        <w:t>3D printed solutions, saving time and money in productio</w:t>
+      </w:r>
+      <w:r>
+        <w:t>n</w:t>
       </w:r>
       <w:r>
         <w:t>.</w:t>
@@ -846,13 +783,13 @@
         </w:rPr>
       </w:pPr>
       <w:r>
-        <w:t>R</w:t>
-      </w:r>
-      <w:r>
-        <w:t>esearch and Development</w:t>
-      </w:r>
-      <w:r>
-        <w:t xml:space="preserve"> Engineering (Co-op) – Hub for Neuroengineering Solutions</w:t>
+        <w:t>Operational Software Developer (Co-op)</w:t>
+      </w:r>
+      <w:r>
+        <w:t xml:space="preserve"> – </w:t>
+      </w:r>
+      <w:r>
+        <w:t>Rocket Factory Augsburg</w:t>
       </w:r>
       <w:r>
         <w:tab/>
@@ -861,7 +798,7 @@
         <w:rPr>
           <w:rStyle w:val="Heading3Char"/>
         </w:rPr>
-        <w:t>January 2024 –</w:t>
+        <w:t>September 2024 –</w:t>
       </w:r>
       <w:r>
         <w:rPr>
@@ -873,7 +810,7 @@
         <w:rPr>
           <w:rStyle w:val="Heading3Char"/>
         </w:rPr>
-        <w:t>April 2024</w:t>
+        <w:t>December 2024</w:t>
       </w:r>
     </w:p>
     <w:p>
@@ -886,7 +823,22 @@
         <w:ind w:left="426" w:hanging="284"/>
       </w:pPr>
       <w:r>
-        <w:t>Developed engineering solutions to create innovative neuroscience research devices at the University of Lethbridge.</w:t>
+        <w:t xml:space="preserve">Developed </w:t>
+      </w:r>
+      <w:r>
+        <w:t xml:space="preserve">operational tools for a 300-person team </w:t>
+      </w:r>
+      <w:r>
+        <w:t>building</w:t>
+      </w:r>
+      <w:r>
+        <w:t xml:space="preserve"> advanced rocket technology</w:t>
+      </w:r>
+      <w:r>
+        <w:t>, using React and FastAPI</w:t>
+      </w:r>
+      <w:r>
+        <w:t>.</w:t>
       </w:r>
     </w:p>
     <w:p>
@@ -899,13 +851,13 @@
         <w:ind w:left="426" w:hanging="284"/>
       </w:pPr>
       <w:r>
-        <w:t>Built full-stack websites for serving collected data, using Django (Python), React (</w:t>
-      </w:r>
-      <w:r>
-        <w:t>JavaScript</w:t>
-      </w:r>
-      <w:r>
-        <w:t>), and SQL databases.</w:t>
+        <w:t>Implemented</w:t>
+      </w:r>
+      <w:r>
+        <w:t xml:space="preserve"> web application features for part and assembly tracking, directly improving production workflow</w:t>
+      </w:r>
+      <w:r>
+        <w:t>.</w:t>
       </w:r>
     </w:p>
     <w:p>
@@ -918,7 +870,19 @@
         <w:ind w:left="426" w:hanging="284"/>
       </w:pPr>
       <w:r>
-        <w:t>Programmed Raspberry Pi microprocessors using Python, to process, interface, and relay recorded information to a user.</w:t>
+        <w:t>Designed and b</w:t>
+      </w:r>
+      <w:r>
+        <w:t xml:space="preserve">uilt a </w:t>
+      </w:r>
+      <w:r>
+        <w:t xml:space="preserve">time tracking application used company-wide, reducing administrative overhead by </w:t>
+      </w:r>
+      <w:r>
+        <w:t>an estimated 60-70</w:t>
+      </w:r>
+      <w:r>
+        <w:t>%.</w:t>
       </w:r>
     </w:p>
     <w:p>
@@ -931,7 +895,34 @@
         <w:ind w:left="426" w:hanging="284"/>
       </w:pPr>
       <w:r>
-        <w:t>Developed embedded systems code in Python for Linux based operating machines, optimizing speed and performance.</w:t>
+        <w:t>I</w:t>
+      </w:r>
+      <w:r>
+        <w:t xml:space="preserve">mproved </w:t>
+      </w:r>
+      <w:r>
+        <w:t>advanced</w:t>
+      </w:r>
+      <w:r>
+        <w:t xml:space="preserve"> database</w:t>
+      </w:r>
+      <w:r>
+        <w:t xml:space="preserve"> ORM</w:t>
+      </w:r>
+      <w:r>
+        <w:t xml:space="preserve"> </w:t>
+      </w:r>
+      <w:r>
+        <w:t>architectures for scalability and speed in PostgreSQL</w:t>
+      </w:r>
+      <w:r>
+        <w:t xml:space="preserve">, reducing complexity </w:t>
+      </w:r>
+      <w:r>
+        <w:t>immensely</w:t>
+      </w:r>
+      <w:r>
+        <w:t>.</w:t>
       </w:r>
     </w:p>
     <w:p>
@@ -944,15 +935,22 @@
         <w:ind w:left="426" w:hanging="284"/>
       </w:pPr>
       <w:r>
-        <w:t xml:space="preserve">Leveraged SolidWorks CAD tools to design mechanical components for 3D printed production, rapid </w:t>
-      </w:r>
-      <w:proofErr w:type="spellStart"/>
-      <w:r>
-        <w:t>iteation</w:t>
-      </w:r>
-      <w:proofErr w:type="spellEnd"/>
-      <w:r>
-        <w:t>, and prototyping.</w:t>
+        <w:t>Optimized</w:t>
+      </w:r>
+      <w:r>
+        <w:t xml:space="preserve"> codebase structure, refactoring and </w:t>
+      </w:r>
+      <w:r>
+        <w:t xml:space="preserve">enhancing </w:t>
+      </w:r>
+      <w:r>
+        <w:t xml:space="preserve">existing code to enhance </w:t>
+      </w:r>
+      <w:r>
+        <w:t>performance</w:t>
+      </w:r>
+      <w:r>
+        <w:t>, reusability, and scalability.</w:t>
       </w:r>
     </w:p>
     <w:p>
@@ -965,7 +963,25 @@
         <w:ind w:left="426" w:hanging="284"/>
       </w:pPr>
       <w:r>
-        <w:t>Designed and built electrical circuitry with microprocessors, sensors, and actuators for ease of use and implementation.</w:t>
+        <w:t>Utilized Git pipelines</w:t>
+      </w:r>
+      <w:r>
+        <w:t xml:space="preserve"> </w:t>
+      </w:r>
+      <w:r>
+        <w:t>to improve testing and</w:t>
+      </w:r>
+      <w:r>
+        <w:t xml:space="preserve"> deployment of applications</w:t>
+      </w:r>
+      <w:r>
+        <w:t xml:space="preserve">, ensuring quality </w:t>
+      </w:r>
+      <w:r>
+        <w:t>and usability of tools</w:t>
+      </w:r>
+      <w:r>
+        <w:t>.</w:t>
       </w:r>
     </w:p>
     <w:p>
@@ -978,7 +994,7 @@
         <w:ind w:left="426" w:hanging="284"/>
       </w:pPr>
       <w:r>
-        <w:t>Designed electrical schematics and printed circuit boards (PCBs) for mass production in Altium Designer.</w:t>
+        <w:t xml:space="preserve">Implemented CRUD features in a modular manner, allowing for optimal code reuse and development ease. </w:t>
       </w:r>
     </w:p>
     <w:p>
@@ -991,39 +1007,43 @@
         <w:ind w:left="426" w:hanging="284"/>
       </w:pPr>
       <w:r>
-        <w:t xml:space="preserve">Debugged </w:t>
-      </w:r>
-      <w:r>
-        <w:t>electrical</w:t>
-      </w:r>
-      <w:r>
-        <w:t xml:space="preserve"> systems with multimeter and oscilloscope testing techniques to find and resolve development issues.</w:t>
-      </w:r>
-    </w:p>
-    <w:p>
-      <w:pPr>
-        <w:pStyle w:val="ListParagraph"/>
-        <w:numPr>
-          <w:ilvl w:val="0"/>
-          <w:numId w:val="2"/>
-        </w:numPr>
-        <w:ind w:left="426" w:hanging="284"/>
-      </w:pPr>
-      <w:r>
-        <w:t>Improved and maintained CNC tools, optimizing production speed and performance.</w:t>
-      </w:r>
-    </w:p>
-    <w:p>
-      <w:pPr>
-        <w:pStyle w:val="ListParagraph"/>
-        <w:numPr>
-          <w:ilvl w:val="0"/>
-          <w:numId w:val="2"/>
-        </w:numPr>
-        <w:ind w:left="426" w:hanging="284"/>
-      </w:pPr>
-      <w:r>
-        <w:t xml:space="preserve">Optimized hardware development workflow through an improved file storage and communication procedure. </w:t>
+        <w:t>Utilized planning</w:t>
+      </w:r>
+      <w:r>
+        <w:t xml:space="preserve">, </w:t>
+      </w:r>
+      <w:r>
+        <w:t>project management</w:t>
+      </w:r>
+      <w:r>
+        <w:t>, and communication</w:t>
+      </w:r>
+      <w:r>
+        <w:t xml:space="preserve"> skills to ensure adoption and </w:t>
+      </w:r>
+      <w:r>
+        <w:t>integration</w:t>
+      </w:r>
+      <w:r>
+        <w:t xml:space="preserve"> of </w:t>
+      </w:r>
+      <w:r>
+        <w:t>tools</w:t>
+      </w:r>
+      <w:r>
+        <w:t xml:space="preserve"> (studying workflow</w:t>
+      </w:r>
+      <w:r>
+        <w:t>s</w:t>
+      </w:r>
+      <w:r>
+        <w:t xml:space="preserve"> and</w:t>
+      </w:r>
+      <w:r>
+        <w:t xml:space="preserve"> designing with the user in mind)</w:t>
+      </w:r>
+      <w:r>
+        <w:t>.</w:t>
       </w:r>
     </w:p>
     <w:p>

</xml_diff>